<commit_message>
Expand MQTT lab report screenshots
</commit_message>
<xml_diff>
--- a/output/mobile-app-practice/05-mqtt-smart-socket/doc/实验5_MQTT智能插座_实验报告.docx
+++ b/output/mobile-app-practice/05-mqtt-smart-socket/doc/实验5_MQTT智能插座_实验报告.docx
@@ -12866,12 +12866,25 @@
     </w:p>
     <w:p>
       <w:pPr>
+        <w:spacing w:after="120"/>
+      </w:pPr>
+      <w:r>
+        <w:rPr>
+          <w:rFonts w:ascii="宋体" w:hAnsi="宋体" w:eastAsia="宋体"/>
+          <w:b w:val="0"/>
+          <w:sz w:val="21"/>
+        </w:rPr>
+        <w:t>以下截图按实验操作流程排列，包含设备平台页面和 Android App 实际运行页面。</w:t>
+      </w:r>
+    </w:p>
+    <w:p>
+      <w:pPr>
         <w:jc w:val="center"/>
       </w:pPr>
       <w:r>
         <w:drawing>
           <wp:inline xmlns:a="http://schemas.openxmlformats.org/drawingml/2006/main" xmlns:pic="http://schemas.openxmlformats.org/drawingml/2006/picture">
-            <wp:extent cx="5029200" cy="3432184"/>
+            <wp:extent cx="4754880" cy="3244974"/>
             <wp:docPr id="16" name="Picture 16"/>
             <wp:cNvGraphicFramePr>
               <a:graphicFrameLocks noChangeAspect="1"/>
@@ -12892,7 +12905,7 @@
                   <pic:spPr>
                     <a:xfrm>
                       <a:off x="0" y="0"/>
-                      <a:ext cx="5029200" cy="3432184"/>
+                      <a:ext cx="4754880" cy="3244974"/>
                     </a:xfrm>
                     <a:prstGeom prst="rect"/>
                   </pic:spPr>
@@ -12905,6 +12918,7 @@
     </w:p>
     <w:p>
       <w:pPr>
+        <w:spacing w:after="160"/>
         <w:jc w:val="center"/>
       </w:pPr>
       <w:r>
@@ -12912,7 +12926,7 @@
           <w:rFonts w:ascii="宋体" w:hAnsi="宋体" w:eastAsia="宋体"/>
           <w:sz w:val="18"/>
         </w:rPr>
-        <w:t>图5-1 设备管理页面，设备已添加并显示在线记录</w:t>
+        <w:t>图5-1 设备管理页面：设备 c82b96f82026 已添加到管理列表，并可查看在线记录。</w:t>
       </w:r>
     </w:p>
     <w:p>
@@ -12922,7 +12936,7 @@
       <w:r>
         <w:drawing>
           <wp:inline xmlns:a="http://schemas.openxmlformats.org/drawingml/2006/main" xmlns:pic="http://schemas.openxmlformats.org/drawingml/2006/picture">
-            <wp:extent cx="5029200" cy="3432184"/>
+            <wp:extent cx="4754880" cy="3244974"/>
             <wp:docPr id="17" name="Picture 17"/>
             <wp:cNvGraphicFramePr>
               <a:graphicFrameLocks noChangeAspect="1"/>
@@ -12943,7 +12957,7 @@
                   <pic:spPr>
                     <a:xfrm>
                       <a:off x="0" y="0"/>
-                      <a:ext cx="5029200" cy="3432184"/>
+                      <a:ext cx="4754880" cy="3244974"/>
                     </a:xfrm>
                     <a:prstGeom prst="rect"/>
                   </pic:spPr>
@@ -12956,6 +12970,7 @@
     </w:p>
     <w:p>
       <w:pPr>
+        <w:spacing w:after="160"/>
         <w:jc w:val="center"/>
       </w:pPr>
       <w:r>
@@ -12963,7 +12978,7 @@
           <w:rFonts w:ascii="宋体" w:hAnsi="宋体" w:eastAsia="宋体"/>
           <w:sz w:val="18"/>
         </w:rPr>
-        <w:t>图5-2 设备详情页面，获取设备 MAC、订阅主题和发布主题</w:t>
+        <w:t>图5-2 设备详情页面：查看设备 MAC、MQTT 地址、订阅主题和发布主题。</w:t>
       </w:r>
     </w:p>
     <w:p>
@@ -12973,7 +12988,7 @@
       <w:r>
         <w:drawing>
           <wp:inline xmlns:a="http://schemas.openxmlformats.org/drawingml/2006/main" xmlns:pic="http://schemas.openxmlformats.org/drawingml/2006/picture">
-            <wp:extent cx="5029200" cy="3432184"/>
+            <wp:extent cx="4754880" cy="3244974"/>
             <wp:docPr id="18" name="Picture 18"/>
             <wp:cNvGraphicFramePr>
               <a:graphicFrameLocks noChangeAspect="1"/>
@@ -12994,7 +13009,7 @@
                   <pic:spPr>
                     <a:xfrm>
                       <a:off x="0" y="0"/>
-                      <a:ext cx="5029200" cy="3432184"/>
+                      <a:ext cx="4754880" cy="3244974"/>
                     </a:xfrm>
                     <a:prstGeom prst="rect"/>
                   </pic:spPr>
@@ -13007,6 +13022,7 @@
     </w:p>
     <w:p>
       <w:pPr>
+        <w:spacing w:after="160"/>
         <w:jc w:val="center"/>
       </w:pPr>
       <w:r>
@@ -13014,7 +13030,7 @@
           <w:rFonts w:ascii="宋体" w:hAnsi="宋体" w:eastAsia="宋体"/>
           <w:sz w:val="18"/>
         </w:rPr>
-        <w:t>图5-3 开发设置页面，获取 MQTT Client ID、用户名和密码（密码已脱敏）</w:t>
+        <w:t>图5-3 开发设置页面：查看 Android 客户端连接 MQTT 所需的 Client ID、用户名和密码（密码已脱敏）。</w:t>
       </w:r>
     </w:p>
     <w:p>
@@ -13024,8 +13040,60 @@
       <w:r>
         <w:drawing>
           <wp:inline xmlns:a="http://schemas.openxmlformats.org/drawingml/2006/main" xmlns:pic="http://schemas.openxmlformats.org/drawingml/2006/picture">
-            <wp:extent cx="5029200" cy="11176000"/>
+            <wp:extent cx="2743200" cy="6096000"/>
             <wp:docPr id="19" name="Picture 19"/>
+            <wp:cNvGraphicFramePr>
+              <a:graphicFrameLocks noChangeAspect="1"/>
+            </wp:cNvGraphicFramePr>
+            <a:graphic>
+              <a:graphicData uri="http://schemas.openxmlformats.org/drawingml/2006/picture">
+                <pic:pic>
+                  <pic:nvPicPr>
+                    <pic:cNvPr id="0" name="03_App运行界面_待填密码.png"/>
+                    <pic:cNvPicPr/>
+                  </pic:nvPicPr>
+                  <pic:blipFill>
+                    <a:blip r:embed="rId28"/>
+                    <a:stretch>
+                      <a:fillRect/>
+                    </a:stretch>
+                  </pic:blipFill>
+                  <pic:spPr>
+                    <a:xfrm>
+                      <a:off x="0" y="0"/>
+                      <a:ext cx="2743200" cy="6096000"/>
+                    </a:xfrm>
+                    <a:prstGeom prst="rect"/>
+                  </pic:spPr>
+                </pic:pic>
+              </a:graphicData>
+            </a:graphic>
+          </wp:inline>
+        </w:drawing>
+      </w:r>
+    </w:p>
+    <w:p>
+      <w:pPr>
+        <w:spacing w:after="160"/>
+        <w:jc w:val="center"/>
+      </w:pPr>
+      <w:r>
+        <w:rPr>
+          <w:rFonts w:ascii="宋体" w:hAnsi="宋体" w:eastAsia="宋体"/>
+          <w:sz w:val="18"/>
+        </w:rPr>
+        <w:t>图5-4 App 首次运行页面：未填真实密码时提示需要在 MqttConfig.java 中补充平台密码。</w:t>
+      </w:r>
+    </w:p>
+    <w:p>
+      <w:pPr>
+        <w:jc w:val="center"/>
+      </w:pPr>
+      <w:r>
+        <w:drawing>
+          <wp:inline xmlns:a="http://schemas.openxmlformats.org/drawingml/2006/main" xmlns:pic="http://schemas.openxmlformats.org/drawingml/2006/picture">
+            <wp:extent cx="2743200" cy="6096000"/>
+            <wp:docPr id="20" name="Picture 20"/>
             <wp:cNvGraphicFramePr>
               <a:graphicFrameLocks noChangeAspect="1"/>
             </wp:cNvGraphicFramePr>
@@ -13037,7 +13105,7 @@
                     <pic:cNvPicPr/>
                   </pic:nvPicPr>
                   <pic:blipFill>
-                    <a:blip r:embed="rId28"/>
+                    <a:blip r:embed="rId29"/>
                     <a:stretch>
                       <a:fillRect/>
                     </a:stretch>
@@ -13045,7 +13113,7 @@
                   <pic:spPr>
                     <a:xfrm>
                       <a:off x="0" y="0"/>
-                      <a:ext cx="5029200" cy="11176000"/>
+                      <a:ext cx="2743200" cy="6096000"/>
                     </a:xfrm>
                     <a:prstGeom prst="rect"/>
                   </pic:spPr>
@@ -13058,6 +13126,7 @@
     </w:p>
     <w:p>
       <w:pPr>
+        <w:spacing w:after="160"/>
         <w:jc w:val="center"/>
       </w:pPr>
       <w:r>
@@ -13065,7 +13134,59 @@
           <w:rFonts w:ascii="宋体" w:hAnsi="宋体" w:eastAsia="宋体"/>
           <w:sz w:val="18"/>
         </w:rPr>
-        <w:t>图5-4 Android App 运行界面，MQTT Broker 连接成功并完成主题订阅</w:t>
+        <w:t>图5-5 App 连接成功页面：成功连接 MQTT Broker，并完成设备发布主题订阅。</w:t>
+      </w:r>
+    </w:p>
+    <w:p>
+      <w:pPr>
+        <w:jc w:val="center"/>
+      </w:pPr>
+      <w:r>
+        <w:drawing>
+          <wp:inline xmlns:a="http://schemas.openxmlformats.org/drawingml/2006/main" xmlns:pic="http://schemas.openxmlformats.org/drawingml/2006/picture">
+            <wp:extent cx="2743200" cy="6096000"/>
+            <wp:docPr id="21" name="Picture 21"/>
+            <wp:cNvGraphicFramePr>
+              <a:graphicFrameLocks noChangeAspect="1"/>
+            </wp:cNvGraphicFramePr>
+            <a:graphic>
+              <a:graphicData uri="http://schemas.openxmlformats.org/drawingml/2006/picture">
+                <pic:pic>
+                  <pic:nvPicPr>
+                    <pic:cNvPr id="0" name="05_App获取设备状态.png"/>
+                    <pic:cNvPicPr/>
+                  </pic:nvPicPr>
+                  <pic:blipFill>
+                    <a:blip r:embed="rId30"/>
+                    <a:stretch>
+                      <a:fillRect/>
+                    </a:stretch>
+                  </pic:blipFill>
+                  <pic:spPr>
+                    <a:xfrm>
+                      <a:off x="0" y="0"/>
+                      <a:ext cx="2743200" cy="6096000"/>
+                    </a:xfrm>
+                    <a:prstGeom prst="rect"/>
+                  </pic:spPr>
+                </pic:pic>
+              </a:graphicData>
+            </a:graphic>
+          </wp:inline>
+        </w:drawing>
+      </w:r>
+    </w:p>
+    <w:p>
+      <w:pPr>
+        <w:spacing w:after="160"/>
+        <w:jc w:val="center"/>
+      </w:pPr>
+      <w:r>
+        <w:rPr>
+          <w:rFonts w:ascii="宋体" w:hAnsi="宋体" w:eastAsia="宋体"/>
+          <w:sz w:val="18"/>
+        </w:rPr>
+        <w:t>图5-6 App 获取设备状态页面：点击“获取设备状态”后向设备发布状态查询消息。</w:t>
       </w:r>
     </w:p>
     <w:p>
@@ -13101,7 +13222,7 @@
       <w:r>
         <w:rPr>
           <w:rFonts w:ascii="Courier New" w:hAnsi="Courier New" w:eastAsia="Consolas"/>
-          <w:sz w:val="16"/>
+          <w:sz w:val="15"/>
         </w:rPr>
         <w:t>package cn.edu.practice.mqttsocket;</w:t>
         <w:br/>
@@ -13160,7 +13281,7 @@
       <w:r>
         <w:rPr>
           <w:rFonts w:ascii="Courier New" w:hAnsi="Courier New" w:eastAsia="Consolas"/>
-          <w:sz w:val="16"/>
+          <w:sz w:val="15"/>
         </w:rPr>
         <w:t>package cn.edu.practice.mqttsocket;</w:t>
         <w:br/>
@@ -13315,17 +13436,7 @@
         <w:br/>
         <w:t xml:space="preserve">                if (client == null || !client.isConnected()) {</w:t>
         <w:br/>
-        <w:t xml:space="preserve">                    Log.w(TAG, "MQTT is not connected, ignore message: " + message);</w:t>
-        <w:br/>
-        <w:t xml:space="preserve">                    return;</w:t>
-        <w:br/>
-        <w:t xml:space="preserve">                }</w:t>
-        <w:br/>
-        <w:t xml:space="preserve">                MqttMessage mqttMessage = new MqttMessage();</w:t>
-        <w:br/>
-        <w:t xml:space="preserve">                mqttMessage.setQos(qos);</w:t>
-        <w:br/>
-        <w:t xml:space="preserve">                mqttMessage.setRetained(fal</w:t>
+        <w:t xml:space="preserve">                    Log.w(TAG, "MQTT is not connected, ignore message: " + m</w:t>
         <w:br/>
         <w:t>// ......后续代码见工程源码文件。</w:t>
       </w:r>
@@ -13350,7 +13461,7 @@
       <w:r>
         <w:rPr>
           <w:rFonts w:ascii="Courier New" w:hAnsi="Courier New" w:eastAsia="Consolas"/>
-          <w:sz w:val="16"/>
+          <w:sz w:val="15"/>
         </w:rPr>
         <w:t>package cn.edu.practice.mqttsocket;</w:t>
         <w:br/>
@@ -13413,7 +13524,7 @@
       <w:r>
         <w:rPr>
           <w:rFonts w:ascii="Courier New" w:hAnsi="Courier New" w:eastAsia="Consolas"/>
-          <w:sz w:val="16"/>
+          <w:sz w:val="15"/>
         </w:rPr>
         <w:t>package cn.edu.practice.mqttsocket;</w:t>
         <w:br/>
@@ -13548,17 +13659,7 @@
         <w:br/>
         <w:t xml:space="preserve">                };</w:t>
         <w:br/>
-        <w:t xml:space="preserve">                Message msg = mainActivity.handler.obtainMessage();</w:t>
-        <w:br/>
-        <w:t xml:space="preserve">                msg.what = MainActivity.MSG_STATUS_DETAIL;</w:t>
-        <w:br/>
-        <w:t xml:space="preserve">                msg.obj = details;</w:t>
-        <w:br/>
-        <w:t xml:space="preserve">                mainActivity.handler.sendMessage(msg);</w:t>
-        <w:br/>
-        <w:t xml:space="preserve">            }</w:t>
-        <w:br/>
-        <w:t xml:space="preserve">            Messag</w:t>
+        <w:t xml:space="preserve">                Message msg = mainActivity.handle</w:t>
         <w:br/>
         <w:t>// ......后续代码见工程源码文件。</w:t>
       </w:r>
@@ -13583,7 +13684,7 @@
       <w:r>
         <w:rPr>
           <w:rFonts w:ascii="Courier New" w:hAnsi="Courier New" w:eastAsia="Consolas"/>
-          <w:sz w:val="16"/>
+          <w:sz w:val="15"/>
         </w:rPr>
         <w:t>package cn.edu.practice.mqttsocket;</w:t>
         <w:br/>
@@ -13762,15 +13863,7 @@
         <w:t xml:space="preserve">    }</w:t>
         <w:br/>
         <w:br/>
-        <w:t xml:space="preserve">    public void showDetailAlertDialog(String[] details) {</w:t>
-        <w:br/>
-        <w:t xml:space="preserve">        AlertDialog alert = new AlertDialog.Builder(this)</w:t>
-        <w:br/>
-        <w:t xml:space="preserve">                .setIcon(R.drawable.ic_socket)</w:t>
-        <w:br/>
-        <w:t xml:space="preserve">                .setTitle("智能转换器信息：")</w:t>
-        <w:br/>
-        <w:t xml:space="preserve">                .setItems(details, new DialogInt</w:t>
+        <w:t xml:space="preserve">    public void showDetailAlertDialog(String[] de</w:t>
         <w:br/>
         <w:t>// ......后续代码见工程源码文件。</w:t>
       </w:r>

</xml_diff>

<commit_message>
Add MQTT lab architecture and status screenshot
</commit_message>
<xml_diff>
--- a/output/mobile-app-practice/05-mqtt-smart-socket/doc/实验5_MQTT智能插座_实验报告.docx
+++ b/output/mobile-app-practice/05-mqtt-smart-socket/doc/实验5_MQTT智能插座_实验报告.docx
@@ -12822,7 +12822,7 @@
           <w:b/>
           <w:sz w:val="21"/>
         </w:rPr>
-        <w:t>1. 实验完成情况</w:t>
+        <w:t>1. 项目整体架构目录</w:t>
       </w:r>
     </w:p>
     <w:p>
@@ -12835,7 +12835,68 @@
           <w:b w:val="0"/>
           <w:sz w:val="21"/>
         </w:rPr>
-        <w:t>本实验已完成基于 MQTT 协议的智能插座 Android 客户端。程序启动后连接 mqtt.smart-bird.cn:1883，使用开发设置中的 Client ID、用户名和密码建立 MQTT 会话，订阅设备发布主题 /LqQAcl/KISoxNrBdGfi/c82b96f82026/publish，并通过发布主题 /LqQAcl/KISoxNrBdGfi/c82b96f82026/subscribe 发送开关和状态查询指令。上传到 GitHub 的版本已对密码做脱敏处理，真实联调时在 MqttConfig.java 中填入开发设置页面的 MQTT 密码即可。</w:t>
+        <w:t>本实验新增模块位于 projects/mobile-app-practice/05-mqtt-smart-socket，整体采用 Android 原生 Java + XML 布局结构，核心逻辑按照“配置参数、MQTT 服务、控制指令、消息回调、界面交互”拆分。</w:t>
+      </w:r>
+    </w:p>
+    <w:p>
+      <w:pPr>
+        <w:spacing w:after="120"/>
+      </w:pPr>
+      <w:r>
+        <w:rPr>
+          <w:rFonts w:ascii="Consolas" w:hAnsi="Consolas" w:eastAsia="Consolas"/>
+          <w:sz w:val="17"/>
+        </w:rPr>
+        <w:t>05-mqtt-smart-socket/</w:t>
+        <w:br/>
+        <w:t>└── app/</w:t>
+        <w:br/>
+        <w:t xml:space="preserve">    ├── build.gradle                         # 添加 Paho MQTT、Gson、AppCompat、ConstraintLayout 依赖</w:t>
+        <w:br/>
+        <w:t xml:space="preserve">    └── src/main/</w:t>
+        <w:br/>
+        <w:t xml:space="preserve">        ├── AndroidManifest.xml              # 注册 INTERNET、WAKE_LOCK、ACCESS_NETWORK_STATE 权限</w:t>
+        <w:br/>
+        <w:t xml:space="preserve">        ├── java/cn/edu/practice/mqttsocket/</w:t>
+        <w:br/>
+        <w:t xml:space="preserve">        │   ├── MainActivity.java            # 主界面、ToggleButton、重新连接、获取状态、Handler 刷新 UI</w:t>
+        <w:br/>
+        <w:t xml:space="preserve">        │   ├── MqttConfig.java              # MQTT 地址、端口、Client ID、用户名、主题和密码占位</w:t>
+        <w:br/>
+        <w:t xml:space="preserve">        │   ├── MqttService.java             # 建立连接、订阅主题、发布消息、判断连接状态</w:t>
+        <w:br/>
+        <w:t xml:space="preserve">        │   ├── MqttController.java          # open、close、getStatus、getInfo 控制指令封装</w:t>
+        <w:br/>
+        <w:t xml:space="preserve">        │   ├── MessageCallback.java         # MQTT 回调，接收消息并用 Gson 解析 JSON</w:t>
+        <w:br/>
+        <w:t xml:space="preserve">        │   └── CallBackVo.java              # current、voltage、power、energy、key 数据 Bean</w:t>
+        <w:br/>
+        <w:t xml:space="preserve">        └── res/</w:t>
+        <w:br/>
+        <w:t xml:space="preserve">            ├── layout/activity_main.xml     # 智能插座操作界面</w:t>
+        <w:br/>
+        <w:t xml:space="preserve">            ├── drawable/checkbox_iphone.xml # ToggleButton selector 开关效果</w:t>
+        <w:br/>
+        <w:t xml:space="preserve">            ├── drawable/checkbox_on.xml     # 开状态图片</w:t>
+        <w:br/>
+        <w:t xml:space="preserve">            ├── drawable/checkbox_off.xml    # 关状态图片</w:t>
+        <w:br/>
+        <w:t xml:space="preserve">            ├── drawable/ic_socket.xml       # 插座图标</w:t>
+        <w:br/>
+        <w:t xml:space="preserve">            └── values/                      # colors、strings、styles 资源文件</w:t>
+      </w:r>
+    </w:p>
+    <w:p>
+      <w:pPr>
+        <w:spacing w:after="120"/>
+      </w:pPr>
+      <w:r>
+        <w:rPr>
+          <w:rFonts w:ascii="宋体" w:hAnsi="宋体" w:eastAsia="宋体"/>
+          <w:b/>
+          <w:sz w:val="21"/>
+        </w:rPr>
+        <w:t>2. 实验完成情况</w:t>
       </w:r>
     </w:p>
     <w:p>
@@ -12848,6 +12909,19 @@
           <w:b w:val="0"/>
           <w:sz w:val="21"/>
         </w:rPr>
+        <w:t>本实验已完成基于 MQTT 协议的智能插座 Android 客户端。程序启动后连接 mqtt.smart-bird.cn:1883，使用开发设置中的 Client ID、用户名和密码建立 MQTT 会话，订阅设备发布主题 /LqQAcl/KISoxNrBdGfi/c82b96f82026/publish，并通过发布主题 /LqQAcl/KISoxNrBdGfi/c82b96f82026/subscribe 发送开关和状态查询指令。上传到 GitHub 的版本已对密码做脱敏处理，真实联调时在 MqttConfig.java 中填入开发设置页面的 MQTT 密码即可。</w:t>
+      </w:r>
+    </w:p>
+    <w:p>
+      <w:pPr>
+        <w:spacing w:after="120"/>
+      </w:pPr>
+      <w:r>
+        <w:rPr>
+          <w:rFonts w:ascii="宋体" w:hAnsi="宋体" w:eastAsia="宋体"/>
+          <w:b w:val="0"/>
+          <w:sz w:val="21"/>
+        </w:rPr>
         <w:t>程序界面包含插座图标、设备 MAC、ToggleButton 开关、重新连接设备按钮、获取设备状态按钮和消息显示区域。ToggleButton 选中时发送 {"type":"event","key":1}，取消选中时发送 {"type":"event","key":0}；点击获取设备状态时发送 {"type":"get"}。回调类接收 JSON 数据后使用 Gson 解析 key、current、voltage、power、energy 等字段，并通过 Handler 更新界面。</w:t>
       </w:r>
     </w:p>
@@ -12861,7 +12935,7 @@
           <w:b/>
           <w:sz w:val="21"/>
         </w:rPr>
-        <w:t>2. 运行截图</w:t>
+        <w:t>3. 运行截图</w:t>
       </w:r>
     </w:p>
     <w:p>
@@ -13153,7 +13227,7 @@
               <a:graphicData uri="http://schemas.openxmlformats.org/drawingml/2006/picture">
                 <pic:pic>
                   <pic:nvPicPr>
-                    <pic:cNvPr id="0" name="05_App获取设备状态.png"/>
+                    <pic:cNvPr id="0" name="06_App获取设备状态_命令已发送.png"/>
                     <pic:cNvPicPr/>
                   </pic:nvPicPr>
                   <pic:blipFill>
@@ -13199,7 +13273,7 @@
           <w:b/>
           <w:sz w:val="21"/>
         </w:rPr>
-        <w:t>3. 核心源码</w:t>
+        <w:t>4. 核心源码</w:t>
       </w:r>
     </w:p>
     <w:p>
@@ -13221,7 +13295,7 @@
       </w:pPr>
       <w:r>
         <w:rPr>
-          <w:rFonts w:ascii="Courier New" w:hAnsi="Courier New" w:eastAsia="Consolas"/>
+          <w:rFonts w:ascii="Consolas" w:hAnsi="Consolas" w:eastAsia="Consolas"/>
           <w:sz w:val="15"/>
         </w:rPr>
         <w:t>package cn.edu.practice.mqttsocket;</w:t>
@@ -13253,7 +13327,9 @@
         <w:br/>
         <w:t xml:space="preserve">    public static boolean hasPassword() {</w:t>
         <w:br/>
-        <w:t xml:space="preserve">        return !"请填写开发设置中的MQTT密码".equals(PASSWORD);</w:t>
+        <w:t xml:space="preserve">        return PASSWORD != null &amp;&amp; !PASSWORD.trim().isEmpty()</w:t>
+        <w:br/>
+        <w:t xml:space="preserve">                &amp;&amp; !"请填写开发设置中的MQTT密码".equals(PASSWORD);</w:t>
         <w:br/>
         <w:t xml:space="preserve">    }</w:t>
         <w:br/>
@@ -13280,7 +13356,7 @@
       </w:pPr>
       <w:r>
         <w:rPr>
-          <w:rFonts w:ascii="Courier New" w:hAnsi="Courier New" w:eastAsia="Consolas"/>
+          <w:rFonts w:ascii="Consolas" w:hAnsi="Consolas" w:eastAsia="Consolas"/>
           <w:sz w:val="15"/>
         </w:rPr>
         <w:t>package cn.edu.practice.mqttsocket;</w:t>
@@ -13460,7 +13536,7 @@
       </w:pPr>
       <w:r>
         <w:rPr>
-          <w:rFonts w:ascii="Courier New" w:hAnsi="Courier New" w:eastAsia="Consolas"/>
+          <w:rFonts w:ascii="Consolas" w:hAnsi="Consolas" w:eastAsia="Consolas"/>
           <w:sz w:val="15"/>
         </w:rPr>
         <w:t>package cn.edu.practice.mqttsocket;</w:t>
@@ -13523,7 +13599,7 @@
       </w:pPr>
       <w:r>
         <w:rPr>
-          <w:rFonts w:ascii="Courier New" w:hAnsi="Courier New" w:eastAsia="Consolas"/>
+          <w:rFonts w:ascii="Consolas" w:hAnsi="Consolas" w:eastAsia="Consolas"/>
           <w:sz w:val="15"/>
         </w:rPr>
         <w:t>package cn.edu.practice.mqttsocket;</w:t>
@@ -13683,7 +13759,7 @@
       </w:pPr>
       <w:r>
         <w:rPr>
-          <w:rFonts w:ascii="Courier New" w:hAnsi="Courier New" w:eastAsia="Consolas"/>
+          <w:rFonts w:ascii="Consolas" w:hAnsi="Consolas" w:eastAsia="Consolas"/>
           <w:sz w:val="15"/>
         </w:rPr>
         <w:t>package cn.edu.practice.mqttsocket;</w:t>
@@ -13851,6 +13927,8 @@
         <w:br/>
         <w:t xml:space="preserve">            MqttController.getStatus();</w:t>
         <w:br/>
+        <w:t xml:space="preserve">            showStatus("已发送获取设备状态命令。\n等待设备通过订阅主题返回功率、电压、电流等数据。");</w:t>
+        <w:br/>
         <w:t xml:space="preserve">        }</w:t>
         <w:br/>
         <w:t xml:space="preserve">    }</w:t>
@@ -13858,12 +13936,7 @@
         <w:br/>
         <w:t xml:space="preserve">    public void showStatus(String text) {</w:t>
         <w:br/>
-        <w:t xml:space="preserve">        tvMsg.setText(text);</w:t>
-        <w:br/>
-        <w:t xml:space="preserve">    }</w:t>
-        <w:br/>
-        <w:br/>
-        <w:t xml:space="preserve">    public void showDetailAlertDialog(String[] de</w:t>
+        <w:t xml:space="preserve">        tvMsg.setTe</w:t>
         <w:br/>
         <w:t>// ......后续代码见工程源码文件。</w:t>
       </w:r>

</xml_diff>